<commit_message>
Build site at 2021-04-30 20:01:11 UTC
</commit_message>
<xml_diff>
--- a/_Drive/Formularios/Mestrado-DoutoradoDireto/Modelo de inscrição.docx
+++ b/_Drive/Formularios/Mestrado-DoutoradoDireto/Modelo de inscrição.docx
@@ -5572,9 +5572,689 @@
         </w:rPr>
         <w:t xml:space="preserve">{{Nome completo}}</w:t>
       </w:r>
+    </w:p>
+    <w:p>
+      <w:pPr>
+        <w:ind w:left="0" w:firstLine="0"/>
+        <w:jc w:val="right"/>
+        <w:rPr>
+          <w:rFonts w:ascii="Times" w:cs="Times" w:eastAsia="Times" w:hAnsi="Times"/>
+          <w:sz w:val="20"/>
+          <w:szCs w:val="20"/>
+        </w:rPr>
+      </w:pPr>
+      <w:bookmarkStart w:colFirst="0" w:colLast="0" w:name="_dz4px36sl49i" w:id="35"/>
+      <w:bookmarkEnd w:id="35"/>
+      <w:r>
+        <w:rPr>
+          <w:rtl w:val="0"/>
+        </w:rPr>
+      </w:r>
+    </w:p>
+    <w:p>
+      <w:pPr>
+        <w:ind w:left="0" w:firstLine="0"/>
+        <w:jc w:val="right"/>
+        <w:rPr>
+          <w:rFonts w:ascii="Times" w:cs="Times" w:eastAsia="Times" w:hAnsi="Times"/>
+          <w:sz w:val="20"/>
+          <w:szCs w:val="20"/>
+        </w:rPr>
+      </w:pPr>
+      <w:bookmarkStart w:colFirst="0" w:colLast="0" w:name="_y87h3y3zxk9b" w:id="36"/>
+      <w:bookmarkEnd w:id="36"/>
+      <w:r>
+        <w:rPr>
+          <w:rtl w:val="0"/>
+        </w:rPr>
+      </w:r>
+    </w:p>
+    <w:p>
+      <w:pPr>
+        <w:ind w:left="0" w:firstLine="0"/>
+        <w:jc w:val="right"/>
+        <w:rPr>
+          <w:rFonts w:ascii="Times" w:cs="Times" w:eastAsia="Times" w:hAnsi="Times"/>
+          <w:sz w:val="20"/>
+          <w:szCs w:val="20"/>
+        </w:rPr>
+      </w:pPr>
+      <w:bookmarkStart w:colFirst="0" w:colLast="0" w:name="_luao2ejmn6mf" w:id="37"/>
+      <w:bookmarkEnd w:id="37"/>
+      <w:r>
+        <w:rPr>
+          <w:rtl w:val="0"/>
+        </w:rPr>
+      </w:r>
+    </w:p>
+    <w:p>
+      <w:pPr>
+        <w:ind w:left="0" w:firstLine="0"/>
+        <w:jc w:val="right"/>
+        <w:rPr>
+          <w:rFonts w:ascii="Times" w:cs="Times" w:eastAsia="Times" w:hAnsi="Times"/>
+          <w:sz w:val="20"/>
+          <w:szCs w:val="20"/>
+        </w:rPr>
+      </w:pPr>
+      <w:bookmarkStart w:colFirst="0" w:colLast="0" w:name="_1st821lmza7n" w:id="38"/>
+      <w:bookmarkEnd w:id="38"/>
+      <w:r>
+        <w:rPr>
+          <w:rtl w:val="0"/>
+        </w:rPr>
+      </w:r>
+    </w:p>
+    <w:p>
+      <w:pPr>
+        <w:ind w:left="0" w:firstLine="0"/>
+        <w:jc w:val="right"/>
+        <w:rPr>
+          <w:rFonts w:ascii="Times" w:cs="Times" w:eastAsia="Times" w:hAnsi="Times"/>
+          <w:sz w:val="20"/>
+          <w:szCs w:val="20"/>
+        </w:rPr>
+      </w:pPr>
+      <w:bookmarkStart w:colFirst="0" w:colLast="0" w:name="_py9ygr3ohrqw" w:id="39"/>
+      <w:bookmarkEnd w:id="39"/>
+      <w:r>
+        <w:rPr>
+          <w:rtl w:val="0"/>
+        </w:rPr>
+      </w:r>
+    </w:p>
+    <w:p>
+      <w:pPr>
+        <w:ind w:left="0" w:firstLine="0"/>
+        <w:jc w:val="right"/>
+        <w:rPr>
+          <w:rFonts w:ascii="Times" w:cs="Times" w:eastAsia="Times" w:hAnsi="Times"/>
+          <w:sz w:val="20"/>
+          <w:szCs w:val="20"/>
+        </w:rPr>
+      </w:pPr>
+      <w:bookmarkStart w:colFirst="0" w:colLast="0" w:name="_qds90896bfzv" w:id="40"/>
+      <w:bookmarkEnd w:id="40"/>
+      <w:r>
+        <w:rPr>
+          <w:rtl w:val="0"/>
+        </w:rPr>
+      </w:r>
+    </w:p>
+    <w:p>
+      <w:pPr>
+        <w:ind w:left="0" w:firstLine="0"/>
+        <w:jc w:val="right"/>
+        <w:rPr>
+          <w:rFonts w:ascii="Times" w:cs="Times" w:eastAsia="Times" w:hAnsi="Times"/>
+          <w:sz w:val="20"/>
+          <w:szCs w:val="20"/>
+        </w:rPr>
+      </w:pPr>
+      <w:bookmarkStart w:colFirst="0" w:colLast="0" w:name="_3ezrmtdz57wu" w:id="41"/>
+      <w:bookmarkEnd w:id="41"/>
+      <w:r>
+        <w:rPr>
+          <w:rFonts w:ascii="Times" w:cs="Times" w:eastAsia="Times" w:hAnsi="Times"/>
+          <w:sz w:val="20"/>
+          <w:szCs w:val="20"/>
+          <w:rtl w:val="0"/>
+        </w:rPr>
+        <w:t xml:space="preserve">Enviado em {{</w:t>
+      </w:r>
+      <w:r>
+        <w:rPr>
+          <w:rFonts w:ascii="Arial" w:cs="Arial" w:eastAsia="Arial" w:hAnsi="Arial"/>
+          <w:sz w:val="20"/>
+          <w:szCs w:val="20"/>
+          <w:rtl w:val="0"/>
+        </w:rPr>
+        <w:t xml:space="preserve">Carimbo de data/hora}}</w:t>
+      </w:r>
       <w:r>
         <w:br w:type="page"/>
       </w:r>
+      <w:r>
+        <w:rPr>
+          <w:rtl w:val="0"/>
+        </w:rPr>
+      </w:r>
+    </w:p>
+    <w:p>
+      <w:pPr>
+        <w:ind w:firstLine="0"/>
+        <w:rPr>
+          <w:rFonts w:ascii="Times" w:cs="Times" w:eastAsia="Times" w:hAnsi="Times"/>
+          <w:sz w:val="20"/>
+          <w:szCs w:val="20"/>
+        </w:rPr>
+      </w:pPr>
+      <w:bookmarkStart w:colFirst="0" w:colLast="0" w:name="_qx7xie3ldikv" w:id="17"/>
+      <w:bookmarkEnd w:id="17"/>
+      <w:r>
+        <w:rPr>
+          <w:rtl w:val="0"/>
+        </w:rPr>
+      </w:r>
+    </w:p>
+    <w:tbl>
+      <w:tblPr>
+        <w:tblStyle w:val="Table9"/>
+        <w:tblW w:w="9405.0" w:type="dxa"/>
+        <w:jc w:val="left"/>
+        <w:tblInd w:w="100.0" w:type="pct"/>
+        <w:tblBorders>
+          <w:top w:color="000000" w:space="0" w:sz="8" w:val="single"/>
+          <w:left w:color="000000" w:space="0" w:sz="8" w:val="single"/>
+          <w:bottom w:color="000000" w:space="0" w:sz="8" w:val="single"/>
+          <w:right w:color="000000" w:space="0" w:sz="8" w:val="single"/>
+          <w:insideH w:color="000000" w:space="0" w:sz="8" w:val="single"/>
+          <w:insideV w:color="000000" w:space="0" w:sz="8" w:val="single"/>
+        </w:tblBorders>
+        <w:tblLayout w:type="fixed"/>
+        <w:tblLook w:val="0600"/>
+      </w:tblPr>
+      <w:tblGrid>
+        <w:gridCol w:w="2940"/>
+        <w:gridCol w:w="2775"/>
+        <w:gridCol w:w="3690"/>
+        <w:tblGridChange w:id="0">
+          <w:tblGrid>
+            <w:gridCol w:w="2940"/>
+            <w:gridCol w:w="2775"/>
+            <w:gridCol w:w="3690"/>
+          </w:tblGrid>
+        </w:tblGridChange>
+      </w:tblGrid>
+      <w:tr>
+        <w:trPr>
+          <w:trHeight w:val="400" w:hRule="atLeast"/>
+        </w:trPr>
+        <w:tc>
+          <w:tcPr>
+            <w:gridSpan w:val="3"/>
+            <w:shd w:fill="cccccc" w:val="clear"/>
+            <w:tcMar>
+              <w:top w:w="100.0" w:type="dxa"/>
+              <w:left w:w="100.0" w:type="dxa"/>
+              <w:bottom w:w="100.0" w:type="dxa"/>
+              <w:right w:w="100.0" w:type="dxa"/>
+            </w:tcMar>
+            <w:vAlign w:val="top"/>
+          </w:tcPr>
+          <w:p>
+            <w:pPr>
+              <w:widowControl w:val="0"/>
+              <w:spacing w:line="240" w:lineRule="auto"/>
+              <w:ind w:firstLine="0"/>
+              <w:jc w:val="center"/>
+              <w:rPr>
+                <w:rFonts w:ascii="Times" w:cs="Times" w:eastAsia="Times" w:hAnsi="Times"/>
+                <w:b w:val="1"/>
+                <w:sz w:val="20"/>
+                <w:szCs w:val="20"/>
+              </w:rPr>
+            </w:pPr>
+            <w:r>
+              <w:rPr>
+                <w:rFonts w:ascii="Times" w:cs="Times" w:eastAsia="Times" w:hAnsi="Times"/>
+                <w:b w:val="1"/>
+                <w:rtl w:val="0"/>
+              </w:rPr>
+              <w:t xml:space="preserve">DADOS PARA SOLICITAÇÃO DE BOLSA</w:t>
+            </w:r>
+            <w:r>
+              <w:rPr>
+                <w:rFonts w:ascii="Times" w:cs="Times" w:eastAsia="Times" w:hAnsi="Times"/>
+                <w:b w:val="1"/>
+                <w:sz w:val="20"/>
+                <w:szCs w:val="20"/>
+                <w:rtl w:val="0"/>
+              </w:rPr>
+              <w:t xml:space="preserve"> - {{Modalidade escolhida}}</w:t>
+            </w:r>
+          </w:p>
+        </w:tc>
+      </w:tr>
+      <w:tr>
+        <w:trPr>
+          <w:trHeight w:val="400" w:hRule="atLeast"/>
+        </w:trPr>
+        <w:tc>
+          <w:tcPr>
+            <w:gridSpan w:val="3"/>
+            <w:shd w:fill="auto" w:val="clear"/>
+            <w:tcMar>
+              <w:top w:w="100.0" w:type="dxa"/>
+              <w:left w:w="100.0" w:type="dxa"/>
+              <w:bottom w:w="100.0" w:type="dxa"/>
+              <w:right w:w="100.0" w:type="dxa"/>
+            </w:tcMar>
+            <w:vAlign w:val="top"/>
+          </w:tcPr>
+          <w:p>
+            <w:pPr>
+              <w:widowControl w:val="0"/>
+              <w:spacing w:line="240" w:lineRule="auto"/>
+              <w:ind w:firstLine="0"/>
+              <w:jc w:val="left"/>
+              <w:rPr>
+                <w:rFonts w:ascii="Times" w:cs="Times" w:eastAsia="Times" w:hAnsi="Times"/>
+                <w:b w:val="1"/>
+                <w:sz w:val="20"/>
+                <w:szCs w:val="20"/>
+              </w:rPr>
+            </w:pPr>
+            <w:r>
+              <w:rPr>
+                <w:rFonts w:ascii="Times" w:cs="Times" w:eastAsia="Times" w:hAnsi="Times"/>
+                <w:b w:val="1"/>
+                <w:sz w:val="20"/>
+                <w:szCs w:val="20"/>
+                <w:rtl w:val="0"/>
+              </w:rPr>
+              <w:t xml:space="preserve">DADOS PESSOAIS</w:t>
+            </w:r>
+          </w:p>
+        </w:tc>
+      </w:tr>
+      <w:tr>
+        <w:trPr>
+          <w:trHeight w:val="400" w:hRule="atLeast"/>
+        </w:trPr>
+        <w:tc>
+          <w:tcPr>
+            <w:gridSpan w:val="3"/>
+            <w:shd w:fill="auto" w:val="clear"/>
+            <w:tcMar>
+              <w:top w:w="100.0" w:type="dxa"/>
+              <w:left w:w="100.0" w:type="dxa"/>
+              <w:bottom w:w="100.0" w:type="dxa"/>
+              <w:right w:w="100.0" w:type="dxa"/>
+            </w:tcMar>
+            <w:vAlign w:val="top"/>
+          </w:tcPr>
+          <w:p>
+            <w:pPr>
+              <w:widowControl w:val="0"/>
+              <w:spacing w:line="240" w:lineRule="auto"/>
+              <w:ind w:firstLine="0"/>
+              <w:jc w:val="left"/>
+              <w:rPr>
+                <w:rFonts w:ascii="Times" w:cs="Times" w:eastAsia="Times" w:hAnsi="Times"/>
+                <w:sz w:val="20"/>
+                <w:szCs w:val="20"/>
+              </w:rPr>
+            </w:pPr>
+            <w:r>
+              <w:rPr>
+                <w:rFonts w:ascii="Times" w:cs="Times" w:eastAsia="Times" w:hAnsi="Times"/>
+                <w:b w:val="1"/>
+                <w:sz w:val="20"/>
+                <w:szCs w:val="20"/>
+                <w:rtl w:val="0"/>
+              </w:rPr>
+              <w:t xml:space="preserve">Nome: </w:t>
+            </w:r>
+            <w:r>
+              <w:rPr>
+                <w:rFonts w:ascii="Times" w:cs="Times" w:eastAsia="Times" w:hAnsi="Times"/>
+                <w:sz w:val="20"/>
+                <w:szCs w:val="20"/>
+                <w:rtl w:val="0"/>
+              </w:rPr>
+              <w:t xml:space="preserve">{{Nome completo}}</w:t>
+            </w:r>
+          </w:p>
+        </w:tc>
+      </w:tr>
+      <w:tr>
+        <w:trPr>
+          <w:trHeight w:val="400" w:hRule="atLeast"/>
+        </w:trPr>
+        <w:tc>
+          <w:tcPr>
+            <w:shd w:fill="auto" w:val="clear"/>
+            <w:tcMar>
+              <w:top w:w="100.0" w:type="dxa"/>
+              <w:left w:w="100.0" w:type="dxa"/>
+              <w:bottom w:w="100.0" w:type="dxa"/>
+              <w:right w:w="100.0" w:type="dxa"/>
+            </w:tcMar>
+            <w:vAlign w:val="top"/>
+          </w:tcPr>
+          <w:p>
+            <w:pPr>
+              <w:widowControl w:val="0"/>
+              <w:spacing w:line="240" w:lineRule="auto"/>
+              <w:ind w:firstLine="0"/>
+              <w:jc w:val="left"/>
+              <w:rPr>
+                <w:rFonts w:ascii="Times" w:cs="Times" w:eastAsia="Times" w:hAnsi="Times"/>
+                <w:sz w:val="20"/>
+                <w:szCs w:val="20"/>
+              </w:rPr>
+            </w:pPr>
+            <w:r>
+              <w:rPr>
+                <w:rFonts w:ascii="Times" w:cs="Times" w:eastAsia="Times" w:hAnsi="Times"/>
+                <w:b w:val="1"/>
+                <w:sz w:val="20"/>
+                <w:szCs w:val="20"/>
+                <w:rtl w:val="0"/>
+              </w:rPr>
+              <w:t xml:space="preserve">Número USP:</w:t>
+            </w:r>
+            <w:r>
+              <w:rPr>
+                <w:rFonts w:ascii="Times" w:cs="Times" w:eastAsia="Times" w:hAnsi="Times"/>
+                <w:sz w:val="20"/>
+                <w:szCs w:val="20"/>
+                <w:rtl w:val="0"/>
+              </w:rPr>
+              <w:t xml:space="preserve"> {{Número USP}}</w:t>
+            </w:r>
+          </w:p>
+        </w:tc>
+        <w:tc>
+          <w:tcPr>
+            <w:shd w:fill="auto" w:val="clear"/>
+            <w:tcMar>
+              <w:top w:w="100.0" w:type="dxa"/>
+              <w:left w:w="100.0" w:type="dxa"/>
+              <w:bottom w:w="100.0" w:type="dxa"/>
+              <w:right w:w="100.0" w:type="dxa"/>
+            </w:tcMar>
+            <w:vAlign w:val="top"/>
+          </w:tcPr>
+          <w:p>
+            <w:pPr>
+              <w:widowControl w:val="0"/>
+              <w:spacing w:line="240" w:lineRule="auto"/>
+              <w:ind w:firstLine="0"/>
+              <w:jc w:val="left"/>
+              <w:rPr>
+                <w:rFonts w:ascii="Times" w:cs="Times" w:eastAsia="Times" w:hAnsi="Times"/>
+                <w:sz w:val="20"/>
+                <w:szCs w:val="20"/>
+              </w:rPr>
+            </w:pPr>
+            <w:r>
+              <w:rPr>
+                <w:rFonts w:ascii="Times" w:cs="Times" w:eastAsia="Times" w:hAnsi="Times"/>
+                <w:b w:val="1"/>
+                <w:sz w:val="20"/>
+                <w:szCs w:val="20"/>
+                <w:rtl w:val="0"/>
+              </w:rPr>
+              <w:t xml:space="preserve">CPF:</w:t>
+            </w:r>
+            <w:r>
+              <w:rPr>
+                <w:rFonts w:ascii="Times" w:cs="Times" w:eastAsia="Times" w:hAnsi="Times"/>
+                <w:sz w:val="20"/>
+                <w:szCs w:val="20"/>
+                <w:rtl w:val="0"/>
+              </w:rPr>
+              <w:t xml:space="preserve"> {{CPF}}</w:t>
+            </w:r>
+            <w:r>
+              <w:rPr>
+                <w:rtl w:val="0"/>
+              </w:rPr>
+            </w:r>
+          </w:p>
+        </w:tc>
+        <w:tc>
+          <w:tcPr>
+            <w:shd w:fill="auto" w:val="clear"/>
+            <w:tcMar>
+              <w:top w:w="100.0" w:type="dxa"/>
+              <w:left w:w="100.0" w:type="dxa"/>
+              <w:bottom w:w="100.0" w:type="dxa"/>
+              <w:right w:w="100.0" w:type="dxa"/>
+            </w:tcMar>
+            <w:vAlign w:val="top"/>
+          </w:tcPr>
+          <w:p>
+            <w:pPr>
+              <w:widowControl w:val="0"/>
+              <w:spacing w:line="240" w:lineRule="auto"/>
+              <w:ind w:firstLine="0"/>
+              <w:jc w:val="left"/>
+              <w:rPr>
+                <w:rFonts w:ascii="Times" w:cs="Times" w:eastAsia="Times" w:hAnsi="Times"/>
+                <w:sz w:val="20"/>
+                <w:szCs w:val="20"/>
+              </w:rPr>
+            </w:pPr>
+            <w:r>
+              <w:rPr>
+                <w:rFonts w:ascii="Times" w:cs="Times" w:eastAsia="Times" w:hAnsi="Times"/>
+                <w:b w:val="1"/>
+                <w:sz w:val="20"/>
+                <w:szCs w:val="20"/>
+                <w:rtl w:val="0"/>
+              </w:rPr>
+              <w:t xml:space="preserve">Data de nascimento:</w:t>
+            </w:r>
+            <w:r>
+              <w:rPr>
+                <w:rFonts w:ascii="Times" w:cs="Times" w:eastAsia="Times" w:hAnsi="Times"/>
+                <w:sz w:val="20"/>
+                <w:szCs w:val="20"/>
+                <w:rtl w:val="0"/>
+              </w:rPr>
+              <w:t xml:space="preserve"> {{</w:t>
+            </w:r>
+            <w:r>
+              <w:rPr>
+                <w:rFonts w:ascii="Arial" w:cs="Arial" w:eastAsia="Arial" w:hAnsi="Arial"/>
+                <w:sz w:val="20"/>
+                <w:szCs w:val="20"/>
+                <w:rtl w:val="0"/>
+              </w:rPr>
+              <w:t xml:space="preserve">Data de nascimento}}</w:t>
+            </w:r>
+            <w:r>
+              <w:rPr>
+                <w:rtl w:val="0"/>
+              </w:rPr>
+            </w:r>
+          </w:p>
+        </w:tc>
+      </w:tr>
+      <w:tr>
+        <w:trPr>
+          <w:trHeight w:val="400" w:hRule="atLeast"/>
+        </w:trPr>
+        <w:tc>
+          <w:tcPr>
+            <w:gridSpan w:val="3"/>
+            <w:shd w:fill="auto" w:val="clear"/>
+            <w:tcMar>
+              <w:top w:w="100.0" w:type="dxa"/>
+              <w:left w:w="100.0" w:type="dxa"/>
+              <w:bottom w:w="100.0" w:type="dxa"/>
+              <w:right w:w="100.0" w:type="dxa"/>
+            </w:tcMar>
+            <w:vAlign w:val="top"/>
+          </w:tcPr>
+          <w:p>
+            <w:pPr>
+              <w:widowControl w:val="0"/>
+              <w:spacing w:line="240" w:lineRule="auto"/>
+              <w:ind w:firstLine="0"/>
+              <w:jc w:val="left"/>
+              <w:rPr>
+                <w:rFonts w:ascii="Times" w:cs="Times" w:eastAsia="Times" w:hAnsi="Times"/>
+                <w:b w:val="1"/>
+                <w:sz w:val="20"/>
+                <w:szCs w:val="20"/>
+              </w:rPr>
+            </w:pPr>
+            <w:r>
+              <w:rPr>
+                <w:rFonts w:ascii="Times" w:cs="Times" w:eastAsia="Times" w:hAnsi="Times"/>
+                <w:b w:val="1"/>
+                <w:sz w:val="20"/>
+                <w:szCs w:val="20"/>
+                <w:rtl w:val="0"/>
+              </w:rPr>
+              <w:t xml:space="preserve">DADOS BANCÁRIOS</w:t>
+            </w:r>
+          </w:p>
+        </w:tc>
+      </w:tr>
+      <w:tr>
+        <w:trPr>
+          <w:trHeight w:val="400" w:hRule="atLeast"/>
+        </w:trPr>
+        <w:tc>
+          <w:tcPr>
+            <w:shd w:fill="auto" w:val="clear"/>
+            <w:tcMar>
+              <w:top w:w="100.0" w:type="dxa"/>
+              <w:left w:w="100.0" w:type="dxa"/>
+              <w:bottom w:w="100.0" w:type="dxa"/>
+              <w:right w:w="100.0" w:type="dxa"/>
+            </w:tcMar>
+            <w:vAlign w:val="top"/>
+          </w:tcPr>
+          <w:p>
+            <w:pPr>
+              <w:widowControl w:val="0"/>
+              <w:spacing w:line="240" w:lineRule="auto"/>
+              <w:ind w:firstLine="0"/>
+              <w:jc w:val="left"/>
+              <w:rPr>
+                <w:rFonts w:ascii="Times" w:cs="Times" w:eastAsia="Times" w:hAnsi="Times"/>
+                <w:sz w:val="20"/>
+                <w:szCs w:val="20"/>
+              </w:rPr>
+            </w:pPr>
+            <w:r>
+              <w:rPr>
+                <w:rFonts w:ascii="Times" w:cs="Times" w:eastAsia="Times" w:hAnsi="Times"/>
+                <w:b w:val="1"/>
+                <w:sz w:val="20"/>
+                <w:szCs w:val="20"/>
+                <w:rtl w:val="0"/>
+              </w:rPr>
+              <w:t xml:space="preserve">Banco:</w:t>
+            </w:r>
+            <w:r>
+              <w:rPr>
+                <w:rFonts w:ascii="Times" w:cs="Times" w:eastAsia="Times" w:hAnsi="Times"/>
+                <w:sz w:val="20"/>
+                <w:szCs w:val="20"/>
+                <w:rtl w:val="0"/>
+              </w:rPr>
+              <w:t xml:space="preserve"> {{Nome do Banco}}</w:t>
+            </w:r>
+          </w:p>
+        </w:tc>
+        <w:tc>
+          <w:tcPr>
+            <w:shd w:fill="auto" w:val="clear"/>
+            <w:tcMar>
+              <w:top w:w="100.0" w:type="dxa"/>
+              <w:left w:w="100.0" w:type="dxa"/>
+              <w:bottom w:w="100.0" w:type="dxa"/>
+              <w:right w:w="100.0" w:type="dxa"/>
+            </w:tcMar>
+            <w:vAlign w:val="top"/>
+          </w:tcPr>
+          <w:p>
+            <w:pPr>
+              <w:widowControl w:val="0"/>
+              <w:spacing w:line="240" w:lineRule="auto"/>
+              <w:ind w:firstLine="0"/>
+              <w:jc w:val="left"/>
+              <w:rPr>
+                <w:rFonts w:ascii="Times" w:cs="Times" w:eastAsia="Times" w:hAnsi="Times"/>
+                <w:sz w:val="20"/>
+                <w:szCs w:val="20"/>
+              </w:rPr>
+            </w:pPr>
+            <w:r>
+              <w:rPr>
+                <w:rFonts w:ascii="Times" w:cs="Times" w:eastAsia="Times" w:hAnsi="Times"/>
+                <w:b w:val="1"/>
+                <w:sz w:val="20"/>
+                <w:szCs w:val="20"/>
+                <w:rtl w:val="0"/>
+              </w:rPr>
+              <w:t xml:space="preserve">Agência:</w:t>
+            </w:r>
+            <w:r>
+              <w:rPr>
+                <w:rFonts w:ascii="Times" w:cs="Times" w:eastAsia="Times" w:hAnsi="Times"/>
+                <w:sz w:val="20"/>
+                <w:szCs w:val="20"/>
+                <w:rtl w:val="0"/>
+              </w:rPr>
+              <w:t xml:space="preserve"> {{Agência}}</w:t>
+            </w:r>
+          </w:p>
+        </w:tc>
+        <w:tc>
+          <w:tcPr>
+            <w:shd w:fill="auto" w:val="clear"/>
+            <w:tcMar>
+              <w:top w:w="100.0" w:type="dxa"/>
+              <w:left w:w="100.0" w:type="dxa"/>
+              <w:bottom w:w="100.0" w:type="dxa"/>
+              <w:right w:w="100.0" w:type="dxa"/>
+            </w:tcMar>
+            <w:vAlign w:val="top"/>
+          </w:tcPr>
+          <w:p>
+            <w:pPr>
+              <w:widowControl w:val="0"/>
+              <w:spacing w:line="240" w:lineRule="auto"/>
+              <w:ind w:firstLine="0"/>
+              <w:jc w:val="left"/>
+              <w:rPr>
+                <w:rFonts w:ascii="Times" w:cs="Times" w:eastAsia="Times" w:hAnsi="Times"/>
+                <w:sz w:val="20"/>
+                <w:szCs w:val="20"/>
+              </w:rPr>
+            </w:pPr>
+            <w:r>
+              <w:rPr>
+                <w:rFonts w:ascii="Times" w:cs="Times" w:eastAsia="Times" w:hAnsi="Times"/>
+                <w:b w:val="1"/>
+                <w:sz w:val="20"/>
+                <w:szCs w:val="20"/>
+                <w:rtl w:val="0"/>
+              </w:rPr>
+              <w:t xml:space="preserve">Conta corrente:</w:t>
+            </w:r>
+            <w:r>
+              <w:rPr>
+                <w:rFonts w:ascii="Times" w:cs="Times" w:eastAsia="Times" w:hAnsi="Times"/>
+                <w:sz w:val="20"/>
+                <w:szCs w:val="20"/>
+                <w:rtl w:val="0"/>
+              </w:rPr>
+              <w:t xml:space="preserve"> {{Conta corrente}}</w:t>
+            </w:r>
+          </w:p>
+        </w:tc>
+      </w:tr>
+    </w:tbl>
+    <w:p>
+      <w:pPr>
+        <w:ind w:firstLine="0"/>
+        <w:rPr>
+          <w:rFonts w:ascii="Times" w:cs="Times" w:eastAsia="Times" w:hAnsi="Times"/>
+          <w:sz w:val="20"/>
+          <w:szCs w:val="20"/>
+        </w:rPr>
+      </w:pPr>
+      <w:bookmarkStart w:colFirst="0" w:colLast="0" w:name="_78sp808vwzbo" w:id="22"/>
+      <w:bookmarkEnd w:id="22"/>
       <w:r>
         <w:rPr>
           <w:rtl w:val="0"/>
@@ -5587,10 +6267,427 @@
         <w:jc w:val="left"/>
         <w:rPr>
           <w:rFonts w:ascii="Times" w:cs="Times" w:eastAsia="Times" w:hAnsi="Times"/>
+          <w:b w:val="1"/>
+          <w:sz w:val="20"/>
+          <w:szCs w:val="20"/>
         </w:rPr>
       </w:pPr>
-      <w:bookmarkStart w:colFirst="0" w:colLast="0" w:name="_7k5acimmwadp" w:id="35"/>
-      <w:bookmarkEnd w:id="35"/>
+      <w:bookmarkStart w:colFirst="0" w:colLast="0" w:name="_303tvpp14eut" w:id="42"/>
+      <w:bookmarkEnd w:id="42"/>
+      <w:r>
+        <w:rPr>
+          <w:rFonts w:ascii="Times" w:cs="Times" w:eastAsia="Times" w:hAnsi="Times"/>
+          <w:b w:val="1"/>
+          <w:sz w:val="20"/>
+          <w:szCs w:val="20"/>
+          <w:rtl w:val="0"/>
+        </w:rPr>
+        <w:t xml:space="preserve">Ano da última titulação:</w:t>
+      </w:r>
+    </w:p>
+    <w:p>
+      <w:pPr>
+        <w:ind w:left="0" w:firstLine="0"/>
+        <w:jc w:val="left"/>
+        <w:rPr>
+          <w:rFonts w:ascii="Times" w:cs="Times" w:eastAsia="Times" w:hAnsi="Times"/>
+          <w:b w:val="1"/>
+          <w:sz w:val="20"/>
+          <w:szCs w:val="20"/>
+        </w:rPr>
+      </w:pPr>
+      <w:bookmarkStart w:colFirst="0" w:colLast="0" w:name="_vbznhry0ni0t" w:id="43"/>
+      <w:bookmarkEnd w:id="43"/>
+      <w:r>
+        <w:rPr>
+          <w:rFonts w:ascii="Times" w:cs="Times" w:eastAsia="Times" w:hAnsi="Times"/>
+          <w:b w:val="1"/>
+          <w:sz w:val="20"/>
+          <w:szCs w:val="20"/>
+          <w:rtl w:val="0"/>
+        </w:rPr>
+        <w:t xml:space="preserve">IES da última titulação:</w:t>
+      </w:r>
+    </w:p>
+    <w:p>
+      <w:pPr>
+        <w:ind w:left="0" w:firstLine="0"/>
+        <w:jc w:val="left"/>
+        <w:rPr>
+          <w:rFonts w:ascii="Times" w:cs="Times" w:eastAsia="Times" w:hAnsi="Times"/>
+          <w:sz w:val="20"/>
+          <w:szCs w:val="20"/>
+        </w:rPr>
+      </w:pPr>
+      <w:bookmarkStart w:colFirst="0" w:colLast="0" w:name="_sdmvjg8yg7i6" w:id="44"/>
+      <w:bookmarkEnd w:id="44"/>
+      <w:r>
+        <w:rPr>
+          <w:rtl w:val="0"/>
+        </w:rPr>
+      </w:r>
+    </w:p>
+    <w:p>
+      <w:pPr>
+        <w:ind w:left="0" w:firstLine="0"/>
+        <w:jc w:val="left"/>
+        <w:rPr>
+          <w:rFonts w:ascii="Times" w:cs="Times" w:eastAsia="Times" w:hAnsi="Times"/>
+          <w:color w:val="ff0000"/>
+          <w:sz w:val="20"/>
+          <w:szCs w:val="20"/>
+        </w:rPr>
+      </w:pPr>
+      <w:bookmarkStart w:colFirst="0" w:colLast="0" w:name="_do66px71vgln" w:id="45"/>
+      <w:bookmarkEnd w:id="45"/>
+      <w:r>
+        <w:rPr>
+          <w:rFonts w:ascii="Times" w:cs="Times" w:eastAsia="Times" w:hAnsi="Times"/>
+          <w:color w:val="ff0000"/>
+          <w:sz w:val="20"/>
+          <w:szCs w:val="20"/>
+          <w:rtl w:val="0"/>
+        </w:rPr>
+        <w:t xml:space="preserve">ATENÇÃO: o preenchimento deste formulário, não implica em concessão de bolsa de estudos por parte de nenhuma</w:t>
+      </w:r>
+    </w:p>
+    <w:p>
+      <w:pPr>
+        <w:ind w:left="0" w:firstLine="0"/>
+        <w:jc w:val="left"/>
+        <w:rPr>
+          <w:rFonts w:ascii="Times" w:cs="Times" w:eastAsia="Times" w:hAnsi="Times"/>
+          <w:color w:val="ff0000"/>
+          <w:sz w:val="20"/>
+          <w:szCs w:val="20"/>
+        </w:rPr>
+      </w:pPr>
+      <w:bookmarkStart w:colFirst="0" w:colLast="0" w:name="_j4lthuol6mgq" w:id="46"/>
+      <w:bookmarkEnd w:id="46"/>
+      <w:r>
+        <w:rPr>
+          <w:rFonts w:ascii="Times" w:cs="Times" w:eastAsia="Times" w:hAnsi="Times"/>
+          <w:color w:val="ff0000"/>
+          <w:sz w:val="20"/>
+          <w:szCs w:val="20"/>
+          <w:rtl w:val="0"/>
+        </w:rPr>
+        <w:t xml:space="preserve">fonte de fomento.</w:t>
+      </w:r>
+    </w:p>
+    <w:p>
+      <w:pPr>
+        <w:ind w:left="0" w:firstLine="0"/>
+        <w:jc w:val="left"/>
+        <w:rPr>
+          <w:rFonts w:ascii="Times" w:cs="Times" w:eastAsia="Times" w:hAnsi="Times"/>
+          <w:sz w:val="20"/>
+          <w:szCs w:val="20"/>
+        </w:rPr>
+      </w:pPr>
+      <w:bookmarkStart w:colFirst="0" w:colLast="0" w:name="_sq8mk13vugfs" w:id="47"/>
+      <w:bookmarkEnd w:id="47"/>
+      <w:r>
+        <w:rPr>
+          <w:rtl w:val="0"/>
+        </w:rPr>
+      </w:r>
+    </w:p>
+    <w:p>
+      <w:pPr>
+        <w:ind w:left="0" w:firstLine="0"/>
+        <w:jc w:val="left"/>
+        <w:rPr>
+          <w:rFonts w:ascii="Times" w:cs="Times" w:eastAsia="Times" w:hAnsi="Times"/>
+          <w:sz w:val="20"/>
+          <w:szCs w:val="20"/>
+        </w:rPr>
+      </w:pPr>
+      <w:bookmarkStart w:colFirst="0" w:colLast="0" w:name="_38ufeut5ouqe" w:id="48"/>
+      <w:bookmarkEnd w:id="48"/>
+      <w:r>
+        <w:rPr>
+          <w:rtl w:val="0"/>
+        </w:rPr>
+      </w:r>
+    </w:p>
+    <w:p>
+      <w:pPr>
+        <w:ind w:firstLine="0"/>
+        <w:jc w:val="right"/>
+        <w:rPr>
+          <w:rFonts w:ascii="Times" w:cs="Times" w:eastAsia="Times" w:hAnsi="Times"/>
+          <w:sz w:val="20"/>
+          <w:szCs w:val="20"/>
+        </w:rPr>
+      </w:pPr>
+      <w:bookmarkStart w:colFirst="0" w:colLast="0" w:name="_zw3sq2e2tn6" w:id="29"/>
+      <w:bookmarkEnd w:id="29"/>
+      <w:r>
+        <w:rPr>
+          <w:rFonts w:ascii="Times" w:cs="Times" w:eastAsia="Times" w:hAnsi="Times"/>
+          <w:sz w:val="20"/>
+          <w:szCs w:val="20"/>
+          <w:rtl w:val="0"/>
+        </w:rPr>
+        <w:t xml:space="preserve">Local e data:___________________________________________</w:t>
+      </w:r>
+    </w:p>
+    <w:p>
+      <w:pPr>
+        <w:ind w:firstLine="0"/>
+        <w:jc w:val="left"/>
+        <w:rPr>
+          <w:rFonts w:ascii="Times" w:cs="Times" w:eastAsia="Times" w:hAnsi="Times"/>
+          <w:sz w:val="20"/>
+          <w:szCs w:val="20"/>
+        </w:rPr>
+      </w:pPr>
+      <w:bookmarkStart w:colFirst="0" w:colLast="0" w:name="_7g3n71klofui" w:id="30"/>
+      <w:bookmarkEnd w:id="30"/>
+      <w:r>
+        <w:rPr>
+          <w:rtl w:val="0"/>
+        </w:rPr>
+      </w:r>
+    </w:p>
+    <w:p>
+      <w:pPr>
+        <w:ind w:firstLine="0"/>
+        <w:jc w:val="left"/>
+        <w:rPr>
+          <w:rFonts w:ascii="Times" w:cs="Times" w:eastAsia="Times" w:hAnsi="Times"/>
+          <w:sz w:val="20"/>
+          <w:szCs w:val="20"/>
+        </w:rPr>
+      </w:pPr>
+      <w:bookmarkStart w:colFirst="0" w:colLast="0" w:name="_fk1r12cd4u0g" w:id="31"/>
+      <w:bookmarkEnd w:id="31"/>
+      <w:r>
+        <w:rPr>
+          <w:rtl w:val="0"/>
+        </w:rPr>
+      </w:r>
+    </w:p>
+    <w:p>
+      <w:pPr>
+        <w:ind w:firstLine="0"/>
+        <w:jc w:val="right"/>
+        <w:rPr>
+          <w:rFonts w:ascii="Times" w:cs="Times" w:eastAsia="Times" w:hAnsi="Times"/>
+          <w:sz w:val="20"/>
+          <w:szCs w:val="20"/>
+        </w:rPr>
+      </w:pPr>
+      <w:bookmarkStart w:colFirst="0" w:colLast="0" w:name="_c2oqsmaz0ybn" w:id="32"/>
+      <w:bookmarkEnd w:id="32"/>
+      <w:r>
+        <w:rPr>
+          <w:rtl w:val="0"/>
+        </w:rPr>
+      </w:r>
+    </w:p>
+    <w:p>
+      <w:pPr>
+        <w:ind w:firstLine="0"/>
+        <w:jc w:val="right"/>
+        <w:rPr>
+          <w:rFonts w:ascii="Times" w:cs="Times" w:eastAsia="Times" w:hAnsi="Times"/>
+          <w:sz w:val="20"/>
+          <w:szCs w:val="20"/>
+        </w:rPr>
+      </w:pPr>
+      <w:bookmarkStart w:colFirst="0" w:colLast="0" w:name="_lyuizxwbhodh" w:id="33"/>
+      <w:bookmarkEnd w:id="33"/>
+      <w:r>
+        <w:rPr>
+          <w:rFonts w:ascii="Times" w:cs="Times" w:eastAsia="Times" w:hAnsi="Times"/>
+          <w:sz w:val="20"/>
+          <w:szCs w:val="20"/>
+          <w:rtl w:val="0"/>
+        </w:rPr>
+        <w:t xml:space="preserve">__________________________________________</w:t>
+      </w:r>
+    </w:p>
+    <w:p>
+      <w:pPr>
+        <w:ind w:firstLine="0"/>
+        <w:jc w:val="right"/>
+        <w:rPr>
+          <w:rFonts w:ascii="Times" w:cs="Times" w:eastAsia="Times" w:hAnsi="Times"/>
+          <w:sz w:val="20"/>
+          <w:szCs w:val="20"/>
+        </w:rPr>
+      </w:pPr>
+      <w:bookmarkStart w:colFirst="0" w:colLast="0" w:name="_sqlmrgj2m06e" w:id="34"/>
+      <w:bookmarkEnd w:id="34"/>
+      <w:r>
+        <w:rPr>
+          <w:rFonts w:ascii="Times" w:cs="Times" w:eastAsia="Times" w:hAnsi="Times"/>
+          <w:sz w:val="20"/>
+          <w:szCs w:val="20"/>
+          <w:rtl w:val="0"/>
+        </w:rPr>
+        <w:t xml:space="preserve">{{Nome completo}}</w:t>
+      </w:r>
+    </w:p>
+    <w:p>
+      <w:pPr>
+        <w:ind w:firstLine="0"/>
+        <w:jc w:val="right"/>
+        <w:rPr>
+          <w:rFonts w:ascii="Times" w:cs="Times" w:eastAsia="Times" w:hAnsi="Times"/>
+          <w:sz w:val="20"/>
+          <w:szCs w:val="20"/>
+        </w:rPr>
+      </w:pPr>
+      <w:bookmarkStart w:colFirst="0" w:colLast="0" w:name="_drh1lx5cbq0s" w:id="49"/>
+      <w:bookmarkEnd w:id="49"/>
+      <w:r>
+        <w:rPr>
+          <w:rtl w:val="0"/>
+        </w:rPr>
+      </w:r>
+    </w:p>
+    <w:p>
+      <w:pPr>
+        <w:ind w:firstLine="0"/>
+        <w:jc w:val="right"/>
+        <w:rPr>
+          <w:rFonts w:ascii="Times" w:cs="Times" w:eastAsia="Times" w:hAnsi="Times"/>
+          <w:sz w:val="20"/>
+          <w:szCs w:val="20"/>
+        </w:rPr>
+      </w:pPr>
+      <w:bookmarkStart w:colFirst="0" w:colLast="0" w:name="_rlc1l2gdpyke" w:id="50"/>
+      <w:bookmarkEnd w:id="50"/>
+      <w:r>
+        <w:rPr>
+          <w:rtl w:val="0"/>
+        </w:rPr>
+      </w:r>
+    </w:p>
+    <w:p>
+      <w:pPr>
+        <w:ind w:firstLine="0"/>
+        <w:jc w:val="right"/>
+        <w:rPr>
+          <w:rFonts w:ascii="Times" w:cs="Times" w:eastAsia="Times" w:hAnsi="Times"/>
+          <w:sz w:val="20"/>
+          <w:szCs w:val="20"/>
+        </w:rPr>
+      </w:pPr>
+      <w:bookmarkStart w:colFirst="0" w:colLast="0" w:name="_6ag350jg5cko" w:id="51"/>
+      <w:bookmarkEnd w:id="51"/>
+      <w:r>
+        <w:rPr>
+          <w:rtl w:val="0"/>
+        </w:rPr>
+      </w:r>
+    </w:p>
+    <w:p>
+      <w:pPr>
+        <w:ind w:firstLine="0"/>
+        <w:jc w:val="right"/>
+        <w:rPr>
+          <w:rFonts w:ascii="Times" w:cs="Times" w:eastAsia="Times" w:hAnsi="Times"/>
+          <w:sz w:val="20"/>
+          <w:szCs w:val="20"/>
+        </w:rPr>
+      </w:pPr>
+      <w:bookmarkStart w:colFirst="0" w:colLast="0" w:name="_h9l0jvb09sp9" w:id="52"/>
+      <w:bookmarkEnd w:id="52"/>
+      <w:r>
+        <w:rPr>
+          <w:rtl w:val="0"/>
+        </w:rPr>
+      </w:r>
+    </w:p>
+    <w:p>
+      <w:pPr>
+        <w:ind w:firstLine="0"/>
+        <w:jc w:val="right"/>
+        <w:rPr>
+          <w:rFonts w:ascii="Times" w:cs="Times" w:eastAsia="Times" w:hAnsi="Times"/>
+          <w:sz w:val="20"/>
+          <w:szCs w:val="20"/>
+        </w:rPr>
+      </w:pPr>
+      <w:bookmarkStart w:colFirst="0" w:colLast="0" w:name="_dcndd5131wkm" w:id="53"/>
+      <w:bookmarkEnd w:id="53"/>
+      <w:r>
+        <w:rPr>
+          <w:rtl w:val="0"/>
+        </w:rPr>
+      </w:r>
+    </w:p>
+    <w:p>
+      <w:pPr>
+        <w:ind w:firstLine="0"/>
+        <w:jc w:val="right"/>
+        <w:rPr>
+          <w:rFonts w:ascii="Times" w:cs="Times" w:eastAsia="Times" w:hAnsi="Times"/>
+          <w:sz w:val="20"/>
+          <w:szCs w:val="20"/>
+        </w:rPr>
+      </w:pPr>
+      <w:bookmarkStart w:colFirst="0" w:colLast="0" w:name="_iiwv3dxi49xa" w:id="54"/>
+      <w:bookmarkEnd w:id="54"/>
+      <w:r>
+        <w:rPr>
+          <w:rtl w:val="0"/>
+        </w:rPr>
+      </w:r>
+    </w:p>
+    <w:p>
+      <w:pPr>
+        <w:ind w:firstLine="0"/>
+        <w:jc w:val="right"/>
+        <w:rPr>
+          <w:rFonts w:ascii="Times" w:cs="Times" w:eastAsia="Times" w:hAnsi="Times"/>
+          <w:sz w:val="20"/>
+          <w:szCs w:val="20"/>
+        </w:rPr>
+      </w:pPr>
+      <w:bookmarkStart w:colFirst="0" w:colLast="0" w:name="_kfwdzofwfpjz" w:id="55"/>
+      <w:bookmarkEnd w:id="55"/>
+      <w:r>
+        <w:rPr>
+          <w:rFonts w:ascii="Times" w:cs="Times" w:eastAsia="Times" w:hAnsi="Times"/>
+          <w:sz w:val="20"/>
+          <w:szCs w:val="20"/>
+          <w:rtl w:val="0"/>
+        </w:rPr>
+        <w:t xml:space="preserve">Enviado em {{</w:t>
+      </w:r>
+      <w:r>
+        <w:rPr>
+          <w:rFonts w:ascii="Arial" w:cs="Arial" w:eastAsia="Arial" w:hAnsi="Arial"/>
+          <w:sz w:val="20"/>
+          <w:szCs w:val="20"/>
+          <w:rtl w:val="0"/>
+        </w:rPr>
+        <w:t xml:space="preserve">Carimbo de data/hora}}</w:t>
+      </w:r>
+      <w:r>
+        <w:br w:type="page"/>
+      </w:r>
+      <w:r>
+        <w:rPr>
+          <w:rtl w:val="0"/>
+        </w:rPr>
+      </w:r>
+    </w:p>
+    <w:p>
+      <w:pPr>
+        <w:ind w:left="0" w:firstLine="0"/>
+        <w:jc w:val="left"/>
+        <w:rPr>
+          <w:rFonts w:ascii="Times" w:cs="Times" w:eastAsia="Times" w:hAnsi="Times"/>
+        </w:rPr>
+      </w:pPr>
+      <w:bookmarkStart w:colFirst="0" w:colLast="0" w:name="_7k5acimmwadp" w:id="56"/>
+      <w:bookmarkEnd w:id="56"/>
       <w:r>
         <w:rPr>
           <w:rFonts w:ascii="Times" w:cs="Times" w:eastAsia="Times" w:hAnsi="Times"/>
@@ -5601,7 +6698,7 @@
     </w:p>
     <w:tbl>
       <w:tblPr>
-        <w:tblStyle w:val="Table9"/>
+        <w:tblStyle w:val="Table10"/>
         <w:tblW w:w="9640.0" w:type="dxa"/>
         <w:jc w:val="left"/>
         <w:tblInd w:w="100.0" w:type="pct"/>
@@ -6076,8 +7173,8 @@
         <w:ind w:left="0" w:firstLine="0"/>
         <w:rPr/>
       </w:pPr>
-      <w:bookmarkStart w:colFirst="0" w:colLast="0" w:name="_tate9ngx9xl6" w:id="36"/>
-      <w:bookmarkEnd w:id="36"/>
+      <w:bookmarkStart w:colFirst="0" w:colLast="0" w:name="_tate9ngx9xl6" w:id="57"/>
+      <w:bookmarkEnd w:id="57"/>
       <w:r>
         <w:rPr>
           <w:rtl w:val="0"/>
@@ -6110,7 +7207,7 @@
   </w:p>
   <w:tbl>
     <w:tblPr>
-      <w:tblStyle w:val="Table10"/>
+      <w:tblStyle w:val="Table11"/>
       <w:tblW w:w="9640.0" w:type="dxa"/>
       <w:jc w:val="left"/>
       <w:tblInd w:w="100.0" w:type="pct"/>
@@ -6441,12 +7538,12 @@
           <wp:extent cx="863842" cy="994728"/>
           <wp:effectExtent b="0" l="0" r="0" t="0"/>
           <wp:wrapSquare wrapText="bothSides" distB="114300" distT="114300" distL="114300" distR="114300"/>
-          <wp:docPr id="2" name="image1.png"/>
+          <wp:docPr id="2" name="image2.png"/>
           <a:graphic>
             <a:graphicData uri="http://schemas.openxmlformats.org/drawingml/2006/picture">
               <pic:pic>
                 <pic:nvPicPr>
-                  <pic:cNvPr id="0" name="image1.png"/>
+                  <pic:cNvPr id="0" name="image2.png"/>
                   <pic:cNvPicPr preferRelativeResize="0"/>
                 </pic:nvPicPr>
                 <pic:blipFill>
@@ -6483,12 +7580,12 @@
           <wp:extent cx="1551940" cy="1163955"/>
           <wp:effectExtent b="0" l="0" r="0" t="0"/>
           <wp:wrapSquare wrapText="bothSides" distB="4445" distT="0" distL="114300" distR="114300"/>
-          <wp:docPr id="1" name="image2.jpg"/>
+          <wp:docPr id="1" name="image1.jpg"/>
           <a:graphic>
             <a:graphicData uri="http://schemas.openxmlformats.org/drawingml/2006/picture">
               <pic:pic>
                 <pic:nvPicPr>
-                  <pic:cNvPr id="0" name="image2.jpg"/>
+                  <pic:cNvPr id="0" name="image1.jpg"/>
                   <pic:cNvPicPr preferRelativeResize="0"/>
                 </pic:nvPicPr>
                 <pic:blipFill>
@@ -6523,8 +7620,8 @@
         <w:szCs w:val="20"/>
       </w:rPr>
     </w:pPr>
-    <w:bookmarkStart w:colFirst="0" w:colLast="0" w:name="_30j0zll" w:id="37"/>
-    <w:bookmarkEnd w:id="37"/>
+    <w:bookmarkStart w:colFirst="0" w:colLast="0" w:name="_30j0zll" w:id="58"/>
+    <w:bookmarkEnd w:id="58"/>
     <w:r>
       <w:rPr>
         <w:rtl w:val="0"/>
@@ -6553,8 +7650,8 @@
         <w:szCs w:val="36"/>
       </w:rPr>
     </w:pPr>
-    <w:bookmarkStart w:colFirst="0" w:colLast="0" w:name="_1fob9te" w:id="38"/>
-    <w:bookmarkEnd w:id="38"/>
+    <w:bookmarkStart w:colFirst="0" w:colLast="0" w:name="_1fob9te" w:id="59"/>
+    <w:bookmarkEnd w:id="59"/>
     <w:r>
       <w:rPr>
         <w:b w:val="1"/>
@@ -6587,8 +7684,8 @@
         <w:szCs w:val="32"/>
       </w:rPr>
     </w:pPr>
-    <w:bookmarkStart w:colFirst="0" w:colLast="0" w:name="_78sieahjud0r" w:id="39"/>
-    <w:bookmarkEnd w:id="39"/>
+    <w:bookmarkStart w:colFirst="0" w:colLast="0" w:name="_78sieahjud0r" w:id="60"/>
+    <w:bookmarkEnd w:id="60"/>
     <w:r>
       <w:rPr>
         <w:b w:val="1"/>
@@ -6621,8 +7718,8 @@
         <w:szCs w:val="28"/>
       </w:rPr>
     </w:pPr>
-    <w:bookmarkStart w:colFirst="0" w:colLast="0" w:name="_to8akbhyhvj1" w:id="40"/>
-    <w:bookmarkEnd w:id="40"/>
+    <w:bookmarkStart w:colFirst="0" w:colLast="0" w:name="_to8akbhyhvj1" w:id="61"/>
+    <w:bookmarkEnd w:id="61"/>
     <w:r>
       <w:rPr>
         <w:b w:val="1"/>
@@ -7071,6 +8168,19 @@
       </w:tblCellMar>
     </w:tblPr>
   </w:style>
+  <w:style w:type="table" w:styleId="Table11">
+    <w:basedOn w:val="TableNormal"/>
+    <w:tblPr>
+      <w:tblStyleRowBandSize w:val="1"/>
+      <w:tblStyleColBandSize w:val="1"/>
+      <w:tblCellMar>
+        <w:top w:w="100.0" w:type="dxa"/>
+        <w:left w:w="100.0" w:type="dxa"/>
+        <w:bottom w:w="100.0" w:type="dxa"/>
+        <w:right w:w="100.0" w:type="dxa"/>
+      </w:tblCellMar>
+    </w:tblPr>
+  </w:style>
 </w:styles>
 </file>
 

</xml_diff>

<commit_message>
Build site at 2021-05-05 20:00:18 UTC
</commit_message>
<xml_diff>
--- a/_Drive/Formularios/Mestrado-DoutoradoDireto/Modelo de inscrição.docx
+++ b/_Drive/Formularios/Mestrado-DoutoradoDireto/Modelo de inscrição.docx
@@ -1700,8 +1700,11 @@
           <w:szCs w:val="20"/>
         </w:rPr>
       </w:pPr>
-      <w:bookmarkStart w:colFirst="0" w:colLast="0" w:name="_j49cl7slff32" w:id="16"/>
+      <w:bookmarkStart w:colFirst="0" w:colLast="0" w:name="_ggyxezisqq8z" w:id="16"/>
       <w:bookmarkEnd w:id="16"/>
+      <w:r>
+        <w:br w:type="page"/>
+      </w:r>
       <w:r>
         <w:rPr>
           <w:rtl w:val="0"/>
@@ -1717,28 +1720,8 @@
           <w:szCs w:val="20"/>
         </w:rPr>
       </w:pPr>
-      <w:bookmarkStart w:colFirst="0" w:colLast="0" w:name="_qx7xie3ldikv" w:id="17"/>
+      <w:bookmarkStart w:colFirst="0" w:colLast="0" w:name="_42jiecaa4pti" w:id="17"/>
       <w:bookmarkEnd w:id="17"/>
-      <w:r>
-        <w:br w:type="page"/>
-      </w:r>
-      <w:r>
-        <w:rPr>
-          <w:rtl w:val="0"/>
-        </w:rPr>
-      </w:r>
-    </w:p>
-    <w:p>
-      <w:pPr>
-        <w:ind w:left="0" w:firstLine="0"/>
-        <w:rPr>
-          <w:rFonts w:ascii="Times" w:cs="Times" w:eastAsia="Times" w:hAnsi="Times"/>
-          <w:sz w:val="20"/>
-          <w:szCs w:val="20"/>
-        </w:rPr>
-      </w:pPr>
-      <w:bookmarkStart w:colFirst="0" w:colLast="0" w:name="_ggyxezisqq8z" w:id="18"/>
-      <w:bookmarkEnd w:id="18"/>
       <w:r>
         <w:rPr>
           <w:rFonts w:ascii="Times" w:cs="Times" w:eastAsia="Times" w:hAnsi="Times"/>
@@ -2574,8 +2557,8 @@
           <w:szCs w:val="20"/>
         </w:rPr>
       </w:pPr>
-      <w:bookmarkStart w:colFirst="0" w:colLast="0" w:name="_c042j3y78fv6" w:id="19"/>
-      <w:bookmarkEnd w:id="19"/>
+      <w:bookmarkStart w:colFirst="0" w:colLast="0" w:name="_c042j3y78fv6" w:id="18"/>
+      <w:bookmarkEnd w:id="18"/>
       <w:r>
         <w:rPr>
           <w:rtl w:val="0"/>
@@ -2591,8 +2574,8 @@
           <w:szCs w:val="20"/>
         </w:rPr>
       </w:pPr>
-      <w:bookmarkStart w:colFirst="0" w:colLast="0" w:name="_qx7xie3ldikv" w:id="17"/>
-      <w:bookmarkEnd w:id="17"/>
+      <w:bookmarkStart w:colFirst="0" w:colLast="0" w:name="_qx7xie3ldikv" w:id="19"/>
+      <w:bookmarkEnd w:id="19"/>
       <w:r>
         <w:rPr>
           <w:rFonts w:ascii="Times" w:cs="Times" w:eastAsia="Times" w:hAnsi="Times"/>
@@ -3348,8 +3331,8 @@
           <w:szCs w:val="20"/>
         </w:rPr>
       </w:pPr>
-      <w:bookmarkStart w:colFirst="0" w:colLast="0" w:name="_c042j3y78fv6" w:id="19"/>
-      <w:bookmarkEnd w:id="19"/>
+      <w:bookmarkStart w:colFirst="0" w:colLast="0" w:name="_c042j3y78fv6" w:id="18"/>
+      <w:bookmarkEnd w:id="18"/>
       <w:r>
         <w:rPr>
           <w:rtl w:val="0"/>
@@ -3365,8 +3348,8 @@
           <w:szCs w:val="20"/>
         </w:rPr>
       </w:pPr>
-      <w:bookmarkStart w:colFirst="0" w:colLast="0" w:name="_qx7xie3ldikv" w:id="17"/>
-      <w:bookmarkEnd w:id="17"/>
+      <w:bookmarkStart w:colFirst="0" w:colLast="0" w:name="_qx7xie3ldikv" w:id="19"/>
+      <w:bookmarkEnd w:id="19"/>
       <w:r>
         <w:rPr>
           <w:rFonts w:ascii="Times" w:cs="Times" w:eastAsia="Times" w:hAnsi="Times"/>
@@ -4122,8 +4105,8 @@
           <w:szCs w:val="20"/>
         </w:rPr>
       </w:pPr>
-      <w:bookmarkStart w:colFirst="0" w:colLast="0" w:name="_c042j3y78fv6" w:id="19"/>
-      <w:bookmarkEnd w:id="19"/>
+      <w:bookmarkStart w:colFirst="0" w:colLast="0" w:name="_c042j3y78fv6" w:id="18"/>
+      <w:bookmarkEnd w:id="18"/>
       <w:r>
         <w:rPr>
           <w:rtl w:val="0"/>
@@ -4896,8 +4879,8 @@
           <w:szCs w:val="20"/>
         </w:rPr>
       </w:pPr>
-      <w:bookmarkStart w:colFirst="0" w:colLast="0" w:name="_c042j3y78fv6" w:id="19"/>
-      <w:bookmarkEnd w:id="19"/>
+      <w:bookmarkStart w:colFirst="0" w:colLast="0" w:name="_jknsel1x2dco" w:id="21"/>
+      <w:bookmarkEnd w:id="21"/>
       <w:r>
         <w:br w:type="page"/>
       </w:r>
@@ -4916,8 +4899,8 @@
           <w:szCs w:val="20"/>
         </w:rPr>
       </w:pPr>
-      <w:bookmarkStart w:colFirst="0" w:colLast="0" w:name="_jknsel1x2dco" w:id="21"/>
-      <w:bookmarkEnd w:id="21"/>
+      <w:bookmarkStart w:colFirst="0" w:colLast="0" w:name="_2nux4z073kq" w:id="22"/>
+      <w:bookmarkEnd w:id="22"/>
       <w:r>
         <w:rPr>
           <w:rFonts w:ascii="Times" w:cs="Times" w:eastAsia="Times" w:hAnsi="Times"/>
@@ -5181,8 +5164,8 @@
           <w:szCs w:val="20"/>
         </w:rPr>
       </w:pPr>
-      <w:bookmarkStart w:colFirst="0" w:colLast="0" w:name="_c042j3y78fv6" w:id="19"/>
-      <w:bookmarkEnd w:id="19"/>
+      <w:bookmarkStart w:colFirst="0" w:colLast="0" w:name="_c042j3y78fv6" w:id="18"/>
+      <w:bookmarkEnd w:id="18"/>
       <w:r>
         <w:rPr>
           <w:rtl w:val="0"/>
@@ -5198,8 +5181,8 @@
           <w:szCs w:val="20"/>
         </w:rPr>
       </w:pPr>
-      <w:bookmarkStart w:colFirst="0" w:colLast="0" w:name="_qx7xie3ldikv" w:id="17"/>
-      <w:bookmarkEnd w:id="17"/>
+      <w:bookmarkStart w:colFirst="0" w:colLast="0" w:name="_qx7xie3ldikv" w:id="19"/>
+      <w:bookmarkEnd w:id="19"/>
       <w:r>
         <w:rPr>
           <w:rFonts w:ascii="Times" w:cs="Times" w:eastAsia="Times" w:hAnsi="Times"/>
@@ -5297,8 +5280,8 @@
           <w:szCs w:val="20"/>
         </w:rPr>
       </w:pPr>
-      <w:bookmarkStart w:colFirst="0" w:colLast="0" w:name="_78sp808vwzbo" w:id="22"/>
-      <w:bookmarkEnd w:id="22"/>
+      <w:bookmarkStart w:colFirst="0" w:colLast="0" w:name="_78sp808vwzbo" w:id="23"/>
+      <w:bookmarkEnd w:id="23"/>
       <w:r>
         <w:rPr>
           <w:rFonts w:ascii="Times" w:cs="Times" w:eastAsia="Times" w:hAnsi="Times"/>
@@ -5328,8 +5311,8 @@
           <w:szCs w:val="20"/>
         </w:rPr>
       </w:pPr>
-      <w:bookmarkStart w:colFirst="0" w:colLast="0" w:name="_k5uifyo63zfu" w:id="23"/>
-      <w:bookmarkEnd w:id="23"/>
+      <w:bookmarkStart w:colFirst="0" w:colLast="0" w:name="_k5uifyo63zfu" w:id="24"/>
+      <w:bookmarkEnd w:id="24"/>
       <w:r>
         <w:rPr>
           <w:rtl w:val="0"/>
@@ -5345,8 +5328,8 @@
           <w:szCs w:val="20"/>
         </w:rPr>
       </w:pPr>
-      <w:bookmarkStart w:colFirst="0" w:colLast="0" w:name="_d7ftgjcevcj" w:id="24"/>
-      <w:bookmarkEnd w:id="24"/>
+      <w:bookmarkStart w:colFirst="0" w:colLast="0" w:name="_d7ftgjcevcj" w:id="25"/>
+      <w:bookmarkEnd w:id="25"/>
       <w:r>
         <w:rPr>
           <w:rtl w:val="0"/>
@@ -5362,8 +5345,8 @@
           <w:szCs w:val="20"/>
         </w:rPr>
       </w:pPr>
-      <w:bookmarkStart w:colFirst="0" w:colLast="0" w:name="_vvkz7afkflx1" w:id="25"/>
-      <w:bookmarkEnd w:id="25"/>
+      <w:bookmarkStart w:colFirst="0" w:colLast="0" w:name="_vvkz7afkflx1" w:id="26"/>
+      <w:bookmarkEnd w:id="26"/>
       <w:r>
         <w:rPr>
           <w:rtl w:val="0"/>
@@ -5380,8 +5363,8 @@
           <w:szCs w:val="20"/>
         </w:rPr>
       </w:pPr>
-      <w:bookmarkStart w:colFirst="0" w:colLast="0" w:name="_wg87k4plykp2" w:id="26"/>
-      <w:bookmarkEnd w:id="26"/>
+      <w:bookmarkStart w:colFirst="0" w:colLast="0" w:name="_wg87k4plykp2" w:id="27"/>
+      <w:bookmarkEnd w:id="27"/>
       <w:r>
         <w:rPr>
           <w:rFonts w:ascii="Times" w:cs="Times" w:eastAsia="Times" w:hAnsi="Times"/>
@@ -5428,8 +5411,8 @@
           <w:szCs w:val="20"/>
         </w:rPr>
       </w:pPr>
-      <w:bookmarkStart w:colFirst="0" w:colLast="0" w:name="_slyqthcmf541" w:id="27"/>
-      <w:bookmarkEnd w:id="27"/>
+      <w:bookmarkStart w:colFirst="0" w:colLast="0" w:name="_slyqthcmf541" w:id="28"/>
+      <w:bookmarkEnd w:id="28"/>
       <w:r>
         <w:rPr>
           <w:rtl w:val="0"/>
@@ -5445,8 +5428,8 @@
           <w:szCs w:val="20"/>
         </w:rPr>
       </w:pPr>
-      <w:bookmarkStart w:colFirst="0" w:colLast="0" w:name="_7tgxdta9p68m" w:id="28"/>
-      <w:bookmarkEnd w:id="28"/>
+      <w:bookmarkStart w:colFirst="0" w:colLast="0" w:name="_7tgxdta9p68m" w:id="29"/>
+      <w:bookmarkEnd w:id="29"/>
       <w:r>
         <w:rPr>
           <w:rtl w:val="0"/>
@@ -5463,8 +5446,8 @@
           <w:szCs w:val="20"/>
         </w:rPr>
       </w:pPr>
-      <w:bookmarkStart w:colFirst="0" w:colLast="0" w:name="_zw3sq2e2tn6" w:id="29"/>
-      <w:bookmarkEnd w:id="29"/>
+      <w:bookmarkStart w:colFirst="0" w:colLast="0" w:name="_zw3sq2e2tn6" w:id="30"/>
+      <w:bookmarkEnd w:id="30"/>
       <w:r>
         <w:rPr>
           <w:rFonts w:ascii="Times" w:cs="Times" w:eastAsia="Times" w:hAnsi="Times"/>
@@ -5485,8 +5468,8 @@
           <w:szCs w:val="20"/>
         </w:rPr>
       </w:pPr>
-      <w:bookmarkStart w:colFirst="0" w:colLast="0" w:name="_7g3n71klofui" w:id="30"/>
-      <w:bookmarkEnd w:id="30"/>
+      <w:bookmarkStart w:colFirst="0" w:colLast="0" w:name="_7g3n71klofui" w:id="31"/>
+      <w:bookmarkEnd w:id="31"/>
       <w:r>
         <w:rPr>
           <w:rtl w:val="0"/>
@@ -5503,8 +5486,8 @@
           <w:szCs w:val="20"/>
         </w:rPr>
       </w:pPr>
-      <w:bookmarkStart w:colFirst="0" w:colLast="0" w:name="_fk1r12cd4u0g" w:id="31"/>
-      <w:bookmarkEnd w:id="31"/>
+      <w:bookmarkStart w:colFirst="0" w:colLast="0" w:name="_fk1r12cd4u0g" w:id="32"/>
+      <w:bookmarkEnd w:id="32"/>
       <w:r>
         <w:rPr>
           <w:rtl w:val="0"/>
@@ -5521,8 +5504,8 @@
           <w:szCs w:val="20"/>
         </w:rPr>
       </w:pPr>
-      <w:bookmarkStart w:colFirst="0" w:colLast="0" w:name="_c2oqsmaz0ybn" w:id="32"/>
-      <w:bookmarkEnd w:id="32"/>
+      <w:bookmarkStart w:colFirst="0" w:colLast="0" w:name="_c2oqsmaz0ybn" w:id="33"/>
+      <w:bookmarkEnd w:id="33"/>
       <w:r>
         <w:rPr>
           <w:rtl w:val="0"/>
@@ -5539,8 +5522,8 @@
           <w:szCs w:val="20"/>
         </w:rPr>
       </w:pPr>
-      <w:bookmarkStart w:colFirst="0" w:colLast="0" w:name="_lyuizxwbhodh" w:id="33"/>
-      <w:bookmarkEnd w:id="33"/>
+      <w:bookmarkStart w:colFirst="0" w:colLast="0" w:name="_lyuizxwbhodh" w:id="34"/>
+      <w:bookmarkEnd w:id="34"/>
       <w:r>
         <w:rPr>
           <w:rFonts w:ascii="Times" w:cs="Times" w:eastAsia="Times" w:hAnsi="Times"/>
@@ -5561,8 +5544,8 @@
           <w:szCs w:val="20"/>
         </w:rPr>
       </w:pPr>
-      <w:bookmarkStart w:colFirst="0" w:colLast="0" w:name="_sqlmrgj2m06e" w:id="34"/>
-      <w:bookmarkEnd w:id="34"/>
+      <w:bookmarkStart w:colFirst="0" w:colLast="0" w:name="_sqlmrgj2m06e" w:id="35"/>
+      <w:bookmarkEnd w:id="35"/>
       <w:r>
         <w:rPr>
           <w:rFonts w:ascii="Times" w:cs="Times" w:eastAsia="Times" w:hAnsi="Times"/>
@@ -5583,8 +5566,8 @@
           <w:szCs w:val="20"/>
         </w:rPr>
       </w:pPr>
-      <w:bookmarkStart w:colFirst="0" w:colLast="0" w:name="_dz4px36sl49i" w:id="35"/>
-      <w:bookmarkEnd w:id="35"/>
+      <w:bookmarkStart w:colFirst="0" w:colLast="0" w:name="_dz4px36sl49i" w:id="36"/>
+      <w:bookmarkEnd w:id="36"/>
       <w:r>
         <w:rPr>
           <w:rtl w:val="0"/>
@@ -5601,8 +5584,8 @@
           <w:szCs w:val="20"/>
         </w:rPr>
       </w:pPr>
-      <w:bookmarkStart w:colFirst="0" w:colLast="0" w:name="_y87h3y3zxk9b" w:id="36"/>
-      <w:bookmarkEnd w:id="36"/>
+      <w:bookmarkStart w:colFirst="0" w:colLast="0" w:name="_y87h3y3zxk9b" w:id="37"/>
+      <w:bookmarkEnd w:id="37"/>
       <w:r>
         <w:rPr>
           <w:rtl w:val="0"/>
@@ -5619,8 +5602,8 @@
           <w:szCs w:val="20"/>
         </w:rPr>
       </w:pPr>
-      <w:bookmarkStart w:colFirst="0" w:colLast="0" w:name="_luao2ejmn6mf" w:id="37"/>
-      <w:bookmarkEnd w:id="37"/>
+      <w:bookmarkStart w:colFirst="0" w:colLast="0" w:name="_luao2ejmn6mf" w:id="38"/>
+      <w:bookmarkEnd w:id="38"/>
       <w:r>
         <w:rPr>
           <w:rtl w:val="0"/>
@@ -5637,8 +5620,8 @@
           <w:szCs w:val="20"/>
         </w:rPr>
       </w:pPr>
-      <w:bookmarkStart w:colFirst="0" w:colLast="0" w:name="_1st821lmza7n" w:id="38"/>
-      <w:bookmarkEnd w:id="38"/>
+      <w:bookmarkStart w:colFirst="0" w:colLast="0" w:name="_1st821lmza7n" w:id="39"/>
+      <w:bookmarkEnd w:id="39"/>
       <w:r>
         <w:rPr>
           <w:rtl w:val="0"/>
@@ -5655,8 +5638,8 @@
           <w:szCs w:val="20"/>
         </w:rPr>
       </w:pPr>
-      <w:bookmarkStart w:colFirst="0" w:colLast="0" w:name="_py9ygr3ohrqw" w:id="39"/>
-      <w:bookmarkEnd w:id="39"/>
+      <w:bookmarkStart w:colFirst="0" w:colLast="0" w:name="_py9ygr3ohrqw" w:id="40"/>
+      <w:bookmarkEnd w:id="40"/>
       <w:r>
         <w:rPr>
           <w:rtl w:val="0"/>
@@ -5673,8 +5656,8 @@
           <w:szCs w:val="20"/>
         </w:rPr>
       </w:pPr>
-      <w:bookmarkStart w:colFirst="0" w:colLast="0" w:name="_qds90896bfzv" w:id="40"/>
-      <w:bookmarkEnd w:id="40"/>
+      <w:bookmarkStart w:colFirst="0" w:colLast="0" w:name="_qds90896bfzv" w:id="41"/>
+      <w:bookmarkEnd w:id="41"/>
       <w:r>
         <w:rPr>
           <w:rtl w:val="0"/>
@@ -5691,8 +5674,8 @@
           <w:szCs w:val="20"/>
         </w:rPr>
       </w:pPr>
-      <w:bookmarkStart w:colFirst="0" w:colLast="0" w:name="_3ezrmtdz57wu" w:id="41"/>
-      <w:bookmarkEnd w:id="41"/>
+      <w:bookmarkStart w:colFirst="0" w:colLast="0" w:name="_3ezrmtdz57wu" w:id="42"/>
+      <w:bookmarkEnd w:id="42"/>
       <w:r>
         <w:rPr>
           <w:rFonts w:ascii="Times" w:cs="Times" w:eastAsia="Times" w:hAnsi="Times"/>
@@ -5729,8 +5712,8 @@
           <w:szCs w:val="20"/>
         </w:rPr>
       </w:pPr>
-      <w:bookmarkStart w:colFirst="0" w:colLast="0" w:name="_qx7xie3ldikv" w:id="17"/>
-      <w:bookmarkEnd w:id="17"/>
+      <w:bookmarkStart w:colFirst="0" w:colLast="0" w:name="_qx7xie3ldikv" w:id="19"/>
+      <w:bookmarkEnd w:id="19"/>
       <w:r>
         <w:rPr>
           <w:rtl w:val="0"/>
@@ -6253,8 +6236,8 @@
           <w:szCs w:val="20"/>
         </w:rPr>
       </w:pPr>
-      <w:bookmarkStart w:colFirst="0" w:colLast="0" w:name="_78sp808vwzbo" w:id="22"/>
-      <w:bookmarkEnd w:id="22"/>
+      <w:bookmarkStart w:colFirst="0" w:colLast="0" w:name="_78sp808vwzbo" w:id="23"/>
+      <w:bookmarkEnd w:id="23"/>
       <w:r>
         <w:rPr>
           <w:rtl w:val="0"/>
@@ -6272,8 +6255,8 @@
           <w:szCs w:val="20"/>
         </w:rPr>
       </w:pPr>
-      <w:bookmarkStart w:colFirst="0" w:colLast="0" w:name="_303tvpp14eut" w:id="42"/>
-      <w:bookmarkEnd w:id="42"/>
+      <w:bookmarkStart w:colFirst="0" w:colLast="0" w:name="_303tvpp14eut" w:id="43"/>
+      <w:bookmarkEnd w:id="43"/>
       <w:r>
         <w:rPr>
           <w:rFonts w:ascii="Times" w:cs="Times" w:eastAsia="Times" w:hAnsi="Times"/>
@@ -6296,8 +6279,8 @@
           <w:szCs w:val="20"/>
         </w:rPr>
       </w:pPr>
-      <w:bookmarkStart w:colFirst="0" w:colLast="0" w:name="_vbznhry0ni0t" w:id="43"/>
-      <w:bookmarkEnd w:id="43"/>
+      <w:bookmarkStart w:colFirst="0" w:colLast="0" w:name="_vbznhry0ni0t" w:id="44"/>
+      <w:bookmarkEnd w:id="44"/>
       <w:r>
         <w:rPr>
           <w:rFonts w:ascii="Times" w:cs="Times" w:eastAsia="Times" w:hAnsi="Times"/>
@@ -6319,8 +6302,8 @@
           <w:szCs w:val="20"/>
         </w:rPr>
       </w:pPr>
-      <w:bookmarkStart w:colFirst="0" w:colLast="0" w:name="_sdmvjg8yg7i6" w:id="44"/>
-      <w:bookmarkEnd w:id="44"/>
+      <w:bookmarkStart w:colFirst="0" w:colLast="0" w:name="_sdmvjg8yg7i6" w:id="45"/>
+      <w:bookmarkEnd w:id="45"/>
       <w:r>
         <w:rPr>
           <w:rtl w:val="0"/>
@@ -6338,8 +6321,8 @@
           <w:szCs w:val="20"/>
         </w:rPr>
       </w:pPr>
-      <w:bookmarkStart w:colFirst="0" w:colLast="0" w:name="_do66px71vgln" w:id="45"/>
-      <w:bookmarkEnd w:id="45"/>
+      <w:bookmarkStart w:colFirst="0" w:colLast="0" w:name="_do66px71vgln" w:id="46"/>
+      <w:bookmarkEnd w:id="46"/>
       <w:r>
         <w:rPr>
           <w:rFonts w:ascii="Times" w:cs="Times" w:eastAsia="Times" w:hAnsi="Times"/>
@@ -6362,8 +6345,8 @@
           <w:szCs w:val="20"/>
         </w:rPr>
       </w:pPr>
-      <w:bookmarkStart w:colFirst="0" w:colLast="0" w:name="_j4lthuol6mgq" w:id="46"/>
-      <w:bookmarkEnd w:id="46"/>
+      <w:bookmarkStart w:colFirst="0" w:colLast="0" w:name="_j4lthuol6mgq" w:id="47"/>
+      <w:bookmarkEnd w:id="47"/>
       <w:r>
         <w:rPr>
           <w:rFonts w:ascii="Times" w:cs="Times" w:eastAsia="Times" w:hAnsi="Times"/>
@@ -6372,7 +6355,7 @@
           <w:szCs w:val="20"/>
           <w:rtl w:val="0"/>
         </w:rPr>
-        <w:t xml:space="preserve">fonte de fomento.</w:t>
+        <w:t xml:space="preserve">fonte de fomento. Caso não deseje solicitar bolsa, ignore esta página.</w:t>
       </w:r>
     </w:p>
     <w:p>
@@ -6385,8 +6368,8 @@
           <w:szCs w:val="20"/>
         </w:rPr>
       </w:pPr>
-      <w:bookmarkStart w:colFirst="0" w:colLast="0" w:name="_sq8mk13vugfs" w:id="47"/>
-      <w:bookmarkEnd w:id="47"/>
+      <w:bookmarkStart w:colFirst="0" w:colLast="0" w:name="_sq8mk13vugfs" w:id="48"/>
+      <w:bookmarkEnd w:id="48"/>
       <w:r>
         <w:rPr>
           <w:rtl w:val="0"/>
@@ -6403,8 +6386,26 @@
           <w:szCs w:val="20"/>
         </w:rPr>
       </w:pPr>
-      <w:bookmarkStart w:colFirst="0" w:colLast="0" w:name="_38ufeut5ouqe" w:id="48"/>
-      <w:bookmarkEnd w:id="48"/>
+      <w:bookmarkStart w:colFirst="0" w:colLast="0" w:name="_38ufeut5ouqe" w:id="49"/>
+      <w:bookmarkEnd w:id="49"/>
+      <w:r>
+        <w:rPr>
+          <w:rtl w:val="0"/>
+        </w:rPr>
+      </w:r>
+    </w:p>
+    <w:p>
+      <w:pPr>
+        <w:ind w:left="0" w:firstLine="0"/>
+        <w:jc w:val="left"/>
+        <w:rPr>
+          <w:rFonts w:ascii="Times" w:cs="Times" w:eastAsia="Times" w:hAnsi="Times"/>
+          <w:sz w:val="20"/>
+          <w:szCs w:val="20"/>
+        </w:rPr>
+      </w:pPr>
+      <w:bookmarkStart w:colFirst="0" w:colLast="0" w:name="_m5xe0m9l4oxd" w:id="50"/>
+      <w:bookmarkEnd w:id="50"/>
       <w:r>
         <w:rPr>
           <w:rtl w:val="0"/>
@@ -6421,8 +6422,8 @@
           <w:szCs w:val="20"/>
         </w:rPr>
       </w:pPr>
-      <w:bookmarkStart w:colFirst="0" w:colLast="0" w:name="_zw3sq2e2tn6" w:id="29"/>
-      <w:bookmarkEnd w:id="29"/>
+      <w:bookmarkStart w:colFirst="0" w:colLast="0" w:name="_zw3sq2e2tn6" w:id="30"/>
+      <w:bookmarkEnd w:id="30"/>
       <w:r>
         <w:rPr>
           <w:rFonts w:ascii="Times" w:cs="Times" w:eastAsia="Times" w:hAnsi="Times"/>
@@ -6443,8 +6444,8 @@
           <w:szCs w:val="20"/>
         </w:rPr>
       </w:pPr>
-      <w:bookmarkStart w:colFirst="0" w:colLast="0" w:name="_7g3n71klofui" w:id="30"/>
-      <w:bookmarkEnd w:id="30"/>
+      <w:bookmarkStart w:colFirst="0" w:colLast="0" w:name="_7g3n71klofui" w:id="31"/>
+      <w:bookmarkEnd w:id="31"/>
       <w:r>
         <w:rPr>
           <w:rtl w:val="0"/>
@@ -6461,8 +6462,8 @@
           <w:szCs w:val="20"/>
         </w:rPr>
       </w:pPr>
-      <w:bookmarkStart w:colFirst="0" w:colLast="0" w:name="_fk1r12cd4u0g" w:id="31"/>
-      <w:bookmarkEnd w:id="31"/>
+      <w:bookmarkStart w:colFirst="0" w:colLast="0" w:name="_fk1r12cd4u0g" w:id="32"/>
+      <w:bookmarkEnd w:id="32"/>
       <w:r>
         <w:rPr>
           <w:rtl w:val="0"/>
@@ -6479,8 +6480,8 @@
           <w:szCs w:val="20"/>
         </w:rPr>
       </w:pPr>
-      <w:bookmarkStart w:colFirst="0" w:colLast="0" w:name="_c2oqsmaz0ybn" w:id="32"/>
-      <w:bookmarkEnd w:id="32"/>
+      <w:bookmarkStart w:colFirst="0" w:colLast="0" w:name="_c2oqsmaz0ybn" w:id="33"/>
+      <w:bookmarkEnd w:id="33"/>
       <w:r>
         <w:rPr>
           <w:rtl w:val="0"/>
@@ -6497,8 +6498,8 @@
           <w:szCs w:val="20"/>
         </w:rPr>
       </w:pPr>
-      <w:bookmarkStart w:colFirst="0" w:colLast="0" w:name="_lyuizxwbhodh" w:id="33"/>
-      <w:bookmarkEnd w:id="33"/>
+      <w:bookmarkStart w:colFirst="0" w:colLast="0" w:name="_lyuizxwbhodh" w:id="34"/>
+      <w:bookmarkEnd w:id="34"/>
       <w:r>
         <w:rPr>
           <w:rFonts w:ascii="Times" w:cs="Times" w:eastAsia="Times" w:hAnsi="Times"/>
@@ -6519,8 +6520,8 @@
           <w:szCs w:val="20"/>
         </w:rPr>
       </w:pPr>
-      <w:bookmarkStart w:colFirst="0" w:colLast="0" w:name="_sqlmrgj2m06e" w:id="34"/>
-      <w:bookmarkEnd w:id="34"/>
+      <w:bookmarkStart w:colFirst="0" w:colLast="0" w:name="_sqlmrgj2m06e" w:id="35"/>
+      <w:bookmarkEnd w:id="35"/>
       <w:r>
         <w:rPr>
           <w:rFonts w:ascii="Times" w:cs="Times" w:eastAsia="Times" w:hAnsi="Times"/>
@@ -6541,8 +6542,8 @@
           <w:szCs w:val="20"/>
         </w:rPr>
       </w:pPr>
-      <w:bookmarkStart w:colFirst="0" w:colLast="0" w:name="_drh1lx5cbq0s" w:id="49"/>
-      <w:bookmarkEnd w:id="49"/>
+      <w:bookmarkStart w:colFirst="0" w:colLast="0" w:name="_drh1lx5cbq0s" w:id="51"/>
+      <w:bookmarkEnd w:id="51"/>
       <w:r>
         <w:rPr>
           <w:rtl w:val="0"/>
@@ -6559,8 +6560,8 @@
           <w:szCs w:val="20"/>
         </w:rPr>
       </w:pPr>
-      <w:bookmarkStart w:colFirst="0" w:colLast="0" w:name="_rlc1l2gdpyke" w:id="50"/>
-      <w:bookmarkEnd w:id="50"/>
+      <w:bookmarkStart w:colFirst="0" w:colLast="0" w:name="_rlc1l2gdpyke" w:id="52"/>
+      <w:bookmarkEnd w:id="52"/>
       <w:r>
         <w:rPr>
           <w:rtl w:val="0"/>
@@ -6577,8 +6578,8 @@
           <w:szCs w:val="20"/>
         </w:rPr>
       </w:pPr>
-      <w:bookmarkStart w:colFirst="0" w:colLast="0" w:name="_6ag350jg5cko" w:id="51"/>
-      <w:bookmarkEnd w:id="51"/>
+      <w:bookmarkStart w:colFirst="0" w:colLast="0" w:name="_6ag350jg5cko" w:id="53"/>
+      <w:bookmarkEnd w:id="53"/>
       <w:r>
         <w:rPr>
           <w:rtl w:val="0"/>
@@ -6595,8 +6596,8 @@
           <w:szCs w:val="20"/>
         </w:rPr>
       </w:pPr>
-      <w:bookmarkStart w:colFirst="0" w:colLast="0" w:name="_h9l0jvb09sp9" w:id="52"/>
-      <w:bookmarkEnd w:id="52"/>
+      <w:bookmarkStart w:colFirst="0" w:colLast="0" w:name="_h9l0jvb09sp9" w:id="54"/>
+      <w:bookmarkEnd w:id="54"/>
       <w:r>
         <w:rPr>
           <w:rtl w:val="0"/>
@@ -6613,8 +6614,8 @@
           <w:szCs w:val="20"/>
         </w:rPr>
       </w:pPr>
-      <w:bookmarkStart w:colFirst="0" w:colLast="0" w:name="_dcndd5131wkm" w:id="53"/>
-      <w:bookmarkEnd w:id="53"/>
+      <w:bookmarkStart w:colFirst="0" w:colLast="0" w:name="_dcndd5131wkm" w:id="55"/>
+      <w:bookmarkEnd w:id="55"/>
       <w:r>
         <w:rPr>
           <w:rtl w:val="0"/>
@@ -6631,8 +6632,8 @@
           <w:szCs w:val="20"/>
         </w:rPr>
       </w:pPr>
-      <w:bookmarkStart w:colFirst="0" w:colLast="0" w:name="_iiwv3dxi49xa" w:id="54"/>
-      <w:bookmarkEnd w:id="54"/>
+      <w:bookmarkStart w:colFirst="0" w:colLast="0" w:name="_iiwv3dxi49xa" w:id="56"/>
+      <w:bookmarkEnd w:id="56"/>
       <w:r>
         <w:rPr>
           <w:rtl w:val="0"/>
@@ -6649,8 +6650,8 @@
           <w:szCs w:val="20"/>
         </w:rPr>
       </w:pPr>
-      <w:bookmarkStart w:colFirst="0" w:colLast="0" w:name="_kfwdzofwfpjz" w:id="55"/>
-      <w:bookmarkEnd w:id="55"/>
+      <w:bookmarkStart w:colFirst="0" w:colLast="0" w:name="_kfwdzofwfpjz" w:id="57"/>
+      <w:bookmarkEnd w:id="57"/>
       <w:r>
         <w:rPr>
           <w:rFonts w:ascii="Times" w:cs="Times" w:eastAsia="Times" w:hAnsi="Times"/>
@@ -6686,8 +6687,8 @@
           <w:rFonts w:ascii="Times" w:cs="Times" w:eastAsia="Times" w:hAnsi="Times"/>
         </w:rPr>
       </w:pPr>
-      <w:bookmarkStart w:colFirst="0" w:colLast="0" w:name="_7k5acimmwadp" w:id="56"/>
-      <w:bookmarkEnd w:id="56"/>
+      <w:bookmarkStart w:colFirst="0" w:colLast="0" w:name="_7k5acimmwadp" w:id="58"/>
+      <w:bookmarkEnd w:id="58"/>
       <w:r>
         <w:rPr>
           <w:rFonts w:ascii="Times" w:cs="Times" w:eastAsia="Times" w:hAnsi="Times"/>
@@ -7173,8 +7174,8 @@
         <w:ind w:left="0" w:firstLine="0"/>
         <w:rPr/>
       </w:pPr>
-      <w:bookmarkStart w:colFirst="0" w:colLast="0" w:name="_tate9ngx9xl6" w:id="57"/>
-      <w:bookmarkEnd w:id="57"/>
+      <w:bookmarkStart w:colFirst="0" w:colLast="0" w:name="_tate9ngx9xl6" w:id="59"/>
+      <w:bookmarkEnd w:id="59"/>
       <w:r>
         <w:rPr>
           <w:rtl w:val="0"/>
@@ -7538,12 +7539,12 @@
           <wp:extent cx="863842" cy="994728"/>
           <wp:effectExtent b="0" l="0" r="0" t="0"/>
           <wp:wrapSquare wrapText="bothSides" distB="114300" distT="114300" distL="114300" distR="114300"/>
-          <wp:docPr id="2" name="image2.png"/>
+          <wp:docPr id="2" name="image1.png"/>
           <a:graphic>
             <a:graphicData uri="http://schemas.openxmlformats.org/drawingml/2006/picture">
               <pic:pic>
                 <pic:nvPicPr>
-                  <pic:cNvPr id="0" name="image2.png"/>
+                  <pic:cNvPr id="0" name="image1.png"/>
                   <pic:cNvPicPr preferRelativeResize="0"/>
                 </pic:nvPicPr>
                 <pic:blipFill>
@@ -7580,12 +7581,12 @@
           <wp:extent cx="1551940" cy="1163955"/>
           <wp:effectExtent b="0" l="0" r="0" t="0"/>
           <wp:wrapSquare wrapText="bothSides" distB="4445" distT="0" distL="114300" distR="114300"/>
-          <wp:docPr id="1" name="image1.jpg"/>
+          <wp:docPr id="1" name="image2.jpg"/>
           <a:graphic>
             <a:graphicData uri="http://schemas.openxmlformats.org/drawingml/2006/picture">
               <pic:pic>
                 <pic:nvPicPr>
-                  <pic:cNvPr id="0" name="image1.jpg"/>
+                  <pic:cNvPr id="0" name="image2.jpg"/>
                   <pic:cNvPicPr preferRelativeResize="0"/>
                 </pic:nvPicPr>
                 <pic:blipFill>
@@ -7620,8 +7621,8 @@
         <w:szCs w:val="20"/>
       </w:rPr>
     </w:pPr>
-    <w:bookmarkStart w:colFirst="0" w:colLast="0" w:name="_30j0zll" w:id="58"/>
-    <w:bookmarkEnd w:id="58"/>
+    <w:bookmarkStart w:colFirst="0" w:colLast="0" w:name="_30j0zll" w:id="60"/>
+    <w:bookmarkEnd w:id="60"/>
     <w:r>
       <w:rPr>
         <w:rtl w:val="0"/>
@@ -7650,8 +7651,8 @@
         <w:szCs w:val="36"/>
       </w:rPr>
     </w:pPr>
-    <w:bookmarkStart w:colFirst="0" w:colLast="0" w:name="_1fob9te" w:id="59"/>
-    <w:bookmarkEnd w:id="59"/>
+    <w:bookmarkStart w:colFirst="0" w:colLast="0" w:name="_1fob9te" w:id="61"/>
+    <w:bookmarkEnd w:id="61"/>
     <w:r>
       <w:rPr>
         <w:b w:val="1"/>
@@ -7684,8 +7685,8 @@
         <w:szCs w:val="32"/>
       </w:rPr>
     </w:pPr>
-    <w:bookmarkStart w:colFirst="0" w:colLast="0" w:name="_78sieahjud0r" w:id="60"/>
-    <w:bookmarkEnd w:id="60"/>
+    <w:bookmarkStart w:colFirst="0" w:colLast="0" w:name="_78sieahjud0r" w:id="62"/>
+    <w:bookmarkEnd w:id="62"/>
     <w:r>
       <w:rPr>
         <w:b w:val="1"/>
@@ -7718,8 +7719,8 @@
         <w:szCs w:val="28"/>
       </w:rPr>
     </w:pPr>
-    <w:bookmarkStart w:colFirst="0" w:colLast="0" w:name="_to8akbhyhvj1" w:id="61"/>
-    <w:bookmarkEnd w:id="61"/>
+    <w:bookmarkStart w:colFirst="0" w:colLast="0" w:name="_to8akbhyhvj1" w:id="63"/>
+    <w:bookmarkEnd w:id="63"/>
     <w:r>
       <w:rPr>
         <w:b w:val="1"/>

</xml_diff>

<commit_message>
Build site at 2021-06-14 16:19:37 UTC
</commit_message>
<xml_diff>
--- a/_Drive/Formularios/Mestrado-DoutoradoDireto/Modelo de inscrição.docx
+++ b/_Drive/Formularios/Mestrado-DoutoradoDireto/Modelo de inscrição.docx
@@ -7539,12 +7539,12 @@
           <wp:extent cx="863842" cy="994728"/>
           <wp:effectExtent b="0" l="0" r="0" t="0"/>
           <wp:wrapSquare wrapText="bothSides" distB="114300" distT="114300" distL="114300" distR="114300"/>
-          <wp:docPr id="2" name="image1.png"/>
+          <wp:docPr id="2" name="image2.png"/>
           <a:graphic>
             <a:graphicData uri="http://schemas.openxmlformats.org/drawingml/2006/picture">
               <pic:pic>
                 <pic:nvPicPr>
-                  <pic:cNvPr id="0" name="image1.png"/>
+                  <pic:cNvPr id="0" name="image2.png"/>
                   <pic:cNvPicPr preferRelativeResize="0"/>
                 </pic:nvPicPr>
                 <pic:blipFill>
@@ -7581,12 +7581,12 @@
           <wp:extent cx="1551940" cy="1163955"/>
           <wp:effectExtent b="0" l="0" r="0" t="0"/>
           <wp:wrapSquare wrapText="bothSides" distB="4445" distT="0" distL="114300" distR="114300"/>
-          <wp:docPr id="1" name="image2.jpg"/>
+          <wp:docPr id="1" name="image1.jpg"/>
           <a:graphic>
             <a:graphicData uri="http://schemas.openxmlformats.org/drawingml/2006/picture">
               <pic:pic>
                 <pic:nvPicPr>
-                  <pic:cNvPr id="0" name="image2.jpg"/>
+                  <pic:cNvPr id="0" name="image1.jpg"/>
                   <pic:cNvPicPr preferRelativeResize="0"/>
                 </pic:nvPicPr>
                 <pic:blipFill>

</xml_diff>